<commit_message>
updated refer doxc with latest version
</commit_message>
<xml_diff>
--- a/Devprasath_resume.docx
+++ b/Devprasath_resume.docx
@@ -197,38 +197,39 @@
         </w:tabs>
         <w:rPr>
           <w:rFonts w:ascii="Arial" w:hAnsi="Arial" w:cs="Arial"/>
-          <w:bCs/>
-          <w:color w:val="404040"/>
-          <w:sz w:val="21"/>
-          <w:szCs w:val="21"/>
-        </w:rPr>
-      </w:pPr>
-      <w:r>
-        <w:rPr>
-          <w:rFonts w:ascii="Arial" w:hAnsi="Arial" w:cs="Arial"/>
-          <w:sz w:val="21"/>
-          <w:szCs w:val="22"/>
-          <w:lang w:val="en-GB"/>
-        </w:rPr>
-        <w:t>Data Scientist with 4+ years of experience in building and deploying scalable ML solutions, optimization engines, model monitoring frameworks, and cloud-native automation platforms on Amazon Web Services and Microsoft Azure. Experienced in MLOps, workflow orchestration, optimization model</w:t>
-      </w:r>
-      <w:r>
-        <w:rPr>
-          <w:rFonts w:ascii="Arial" w:hAnsi="Arial" w:cs="Arial"/>
-          <w:sz w:val="21"/>
-          <w:szCs w:val="22"/>
-          <w:lang w:val="en-GB"/>
-        </w:rPr>
-        <w:t>l</w:t>
-      </w:r>
-      <w:r>
-        <w:rPr>
-          <w:rFonts w:ascii="Arial" w:hAnsi="Arial" w:cs="Arial"/>
-          <w:sz w:val="21"/>
-          <w:szCs w:val="22"/>
-          <w:lang w:val="en-GB"/>
-        </w:rPr>
-        <w:t>ing, event-driven architectures, and enterprise data modernization using Apache Airflow, Google OR-Tools, and CI/CD pipelines. Proven track record of leading high-impact enterprise initiatives delivering measurable operational efficiency, automation, and cost optimization.</w:t>
+          <w:sz w:val="21"/>
+          <w:szCs w:val="22"/>
+          <w:lang w:val="en-GB"/>
+        </w:rPr>
+      </w:pPr>
+      <w:r>
+        <w:rPr>
+          <w:rFonts w:ascii="Arial" w:hAnsi="Arial" w:cs="Arial"/>
+          <w:sz w:val="21"/>
+          <w:szCs w:val="22"/>
+          <w:lang w:val="en-GB"/>
+        </w:rPr>
+        <w:t xml:space="preserve">Data Scientist with 4+ years of experience building and deploying scalable ML solutions, optimization engines, and model monitoring frameworks on AWS. Experienced in constraint optimization, linear programming, churn prediction, </w:t>
+      </w:r>
+      <w:proofErr w:type="spellStart"/>
+      <w:r>
+        <w:rPr>
+          <w:rFonts w:ascii="Arial" w:hAnsi="Arial" w:cs="Arial"/>
+          <w:sz w:val="21"/>
+          <w:szCs w:val="22"/>
+          <w:lang w:val="en-GB"/>
+        </w:rPr>
+        <w:t>MLOps</w:t>
+      </w:r>
+      <w:proofErr w:type="spellEnd"/>
+      <w:r>
+        <w:rPr>
+          <w:rFonts w:ascii="Arial" w:hAnsi="Arial" w:cs="Arial"/>
+          <w:sz w:val="21"/>
+          <w:szCs w:val="22"/>
+          <w:lang w:val="en-GB"/>
+        </w:rPr>
+        <w:t xml:space="preserve"> and production monitoring across enterprise environments. Skilled in Python, Apache Airflow, cloud-native architectures, and workflow automation, with a proven track record of leading cross-functional teams and delivering measurable operational efficiency and cost optimization initiatives.</w:t>
       </w:r>
     </w:p>
     <w:p>
@@ -486,24 +487,79 @@
         <w:rPr>
           <w:rFonts w:ascii="Arial" w:hAnsi="Arial" w:cs="Arial"/>
           <w:i/>
-          <w:iCs/>
-          <w:sz w:val="21"/>
-          <w:szCs w:val="21"/>
-          <w:lang w:val="en-GB"/>
-        </w:rPr>
-      </w:pPr>
-      <w:r>
-        <w:rPr>
-          <w:rFonts w:ascii="Arial" w:hAnsi="Arial" w:cs="Arial"/>
-          <w:i/>
-          <w:iCs/>
-          <w:sz w:val="21"/>
-          <w:szCs w:val="21"/>
-          <w:lang w:val="en-GB"/>
-        </w:rPr>
-        <w:t>Data Scientist - IV</w:t>
-      </w:r>
-      <w:r>
+          <w:sz w:val="21"/>
+          <w:szCs w:val="22"/>
+          <w:lang w:val="en-GB"/>
+        </w:rPr>
+      </w:pPr>
+      <w:r>
+        <w:rPr>
+          <w:rFonts w:ascii="Arial" w:hAnsi="Arial" w:cs="Arial"/>
+          <w:i/>
+          <w:sz w:val="21"/>
+          <w:szCs w:val="22"/>
+          <w:lang w:val="en-GB"/>
+        </w:rPr>
+        <w:t xml:space="preserve">Data Scientist </w:t>
+      </w:r>
+      <w:r>
+        <w:rPr>
+          <w:rFonts w:ascii="Arial" w:hAnsi="Arial" w:cs="Arial"/>
+          <w:i/>
+          <w:sz w:val="21"/>
+          <w:szCs w:val="22"/>
+          <w:lang w:val="en-GB"/>
+        </w:rPr>
+        <w:t>–</w:t>
+      </w:r>
+      <w:r>
+        <w:rPr>
+          <w:rFonts w:ascii="Arial" w:hAnsi="Arial" w:cs="Arial"/>
+          <w:i/>
+          <w:sz w:val="21"/>
+          <w:szCs w:val="22"/>
+          <w:lang w:val="en-GB"/>
+        </w:rPr>
+        <w:t xml:space="preserve"> IV</w:t>
+      </w:r>
+      <w:r>
+        <w:rPr>
+          <w:rFonts w:ascii="Arial" w:hAnsi="Arial" w:cs="Arial"/>
+          <w:i/>
+          <w:sz w:val="21"/>
+          <w:szCs w:val="22"/>
+          <w:lang w:val="en-GB"/>
+        </w:rPr>
+        <w:t xml:space="preserve">                                                                                                                     </w:t>
+      </w:r>
+      <w:r>
+        <w:rPr>
+          <w:rFonts w:ascii="Arial" w:hAnsi="Arial" w:cs="Arial"/>
+          <w:i/>
+          <w:sz w:val="21"/>
+          <w:szCs w:val="22"/>
+          <w:lang w:val="en-GB"/>
+        </w:rPr>
+        <w:t xml:space="preserve"> </w:t>
+      </w:r>
+      <w:r>
+        <w:rPr>
+          <w:rFonts w:ascii="Arial" w:hAnsi="Arial" w:cs="Arial"/>
+          <w:i/>
+          <w:sz w:val="21"/>
+          <w:szCs w:val="22"/>
+          <w:lang w:val="en-GB"/>
+        </w:rPr>
+        <w:t>Jan 2026 – Present</w:t>
+      </w:r>
+      <w:r>
+        <w:rPr>
+          <w:rFonts w:ascii="Arial" w:hAnsi="Arial" w:cs="Arial"/>
+          <w:i/>
+          <w:sz w:val="21"/>
+          <w:szCs w:val="22"/>
+          <w:lang w:val="en-GB"/>
+        </w:rPr>
         <w:tab/>
       </w:r>
     </w:p>
@@ -793,24 +849,69 @@
         <w:rPr>
           <w:rFonts w:ascii="Arial" w:hAnsi="Arial" w:cs="Arial"/>
           <w:i/>
-          <w:iCs/>
-          <w:sz w:val="21"/>
-          <w:szCs w:val="21"/>
-          <w:lang w:val="en-GB"/>
-        </w:rPr>
-      </w:pPr>
-      <w:r>
-        <w:rPr>
-          <w:rFonts w:ascii="Arial" w:hAnsi="Arial" w:cs="Arial"/>
-          <w:i/>
-          <w:iCs/>
-          <w:sz w:val="21"/>
-          <w:szCs w:val="21"/>
-          <w:lang w:val="en-GB"/>
-        </w:rPr>
-        <w:t>Data Scientist - III</w:t>
-      </w:r>
-      <w:r>
+          <w:sz w:val="21"/>
+          <w:szCs w:val="22"/>
+          <w:lang w:val="en-GB"/>
+        </w:rPr>
+      </w:pPr>
+      <w:r>
+        <w:rPr>
+          <w:rFonts w:ascii="Arial" w:hAnsi="Arial" w:cs="Arial"/>
+          <w:i/>
+          <w:sz w:val="21"/>
+          <w:szCs w:val="22"/>
+          <w:lang w:val="en-GB"/>
+        </w:rPr>
+        <w:t xml:space="preserve">Data Scientist </w:t>
+      </w:r>
+      <w:r>
+        <w:rPr>
+          <w:rFonts w:ascii="Arial" w:hAnsi="Arial" w:cs="Arial"/>
+          <w:i/>
+          <w:sz w:val="21"/>
+          <w:szCs w:val="22"/>
+          <w:lang w:val="en-GB"/>
+        </w:rPr>
+        <w:t>–</w:t>
+      </w:r>
+      <w:r>
+        <w:rPr>
+          <w:rFonts w:ascii="Arial" w:hAnsi="Arial" w:cs="Arial"/>
+          <w:i/>
+          <w:sz w:val="21"/>
+          <w:szCs w:val="22"/>
+          <w:lang w:val="en-GB"/>
+        </w:rPr>
+        <w:t xml:space="preserve"> III</w:t>
+      </w:r>
+      <w:r>
+        <w:rPr>
+          <w:rFonts w:ascii="Arial" w:hAnsi="Arial" w:cs="Arial"/>
+          <w:i/>
+          <w:sz w:val="21"/>
+          <w:szCs w:val="22"/>
+          <w:lang w:val="en-GB"/>
+        </w:rPr>
+        <w:t xml:space="preserve">                                                                                                                   </w:t>
+      </w:r>
+      <w:r>
+        <w:rPr>
+          <w:rFonts w:ascii="Arial" w:hAnsi="Arial" w:cs="Arial"/>
+          <w:i/>
+          <w:sz w:val="21"/>
+          <w:szCs w:val="22"/>
+          <w:lang w:val="en-GB"/>
+        </w:rPr>
+        <w:t>May 2025 – Dec 2025</w:t>
+      </w:r>
+      <w:r>
+        <w:rPr>
+          <w:rFonts w:ascii="Arial" w:hAnsi="Arial" w:cs="Arial"/>
+          <w:i/>
+          <w:sz w:val="21"/>
+          <w:szCs w:val="22"/>
+          <w:lang w:val="en-GB"/>
+        </w:rPr>
         <w:tab/>
       </w:r>
     </w:p>
@@ -973,24 +1074,69 @@
         <w:rPr>
           <w:rFonts w:ascii="Arial" w:hAnsi="Arial" w:cs="Arial"/>
           <w:i/>
-          <w:iCs/>
-          <w:sz w:val="21"/>
-          <w:szCs w:val="21"/>
-          <w:lang w:val="en-GB"/>
-        </w:rPr>
-      </w:pPr>
-      <w:r>
-        <w:rPr>
-          <w:rFonts w:ascii="Arial" w:hAnsi="Arial" w:cs="Arial"/>
-          <w:i/>
-          <w:iCs/>
-          <w:sz w:val="21"/>
-          <w:szCs w:val="21"/>
-          <w:lang w:val="en-GB"/>
-        </w:rPr>
-        <w:t>Data Scientist - III</w:t>
-      </w:r>
-      <w:r>
+          <w:sz w:val="21"/>
+          <w:szCs w:val="22"/>
+          <w:lang w:val="en-GB"/>
+        </w:rPr>
+      </w:pPr>
+      <w:r>
+        <w:rPr>
+          <w:rFonts w:ascii="Arial" w:hAnsi="Arial" w:cs="Arial"/>
+          <w:i/>
+          <w:sz w:val="21"/>
+          <w:szCs w:val="22"/>
+          <w:lang w:val="en-GB"/>
+        </w:rPr>
+        <w:t xml:space="preserve">Data Scientist </w:t>
+      </w:r>
+      <w:r>
+        <w:rPr>
+          <w:rFonts w:ascii="Arial" w:hAnsi="Arial" w:cs="Arial"/>
+          <w:i/>
+          <w:sz w:val="21"/>
+          <w:szCs w:val="22"/>
+          <w:lang w:val="en-GB"/>
+        </w:rPr>
+        <w:t>–</w:t>
+      </w:r>
+      <w:r>
+        <w:rPr>
+          <w:rFonts w:ascii="Arial" w:hAnsi="Arial" w:cs="Arial"/>
+          <w:i/>
+          <w:sz w:val="21"/>
+          <w:szCs w:val="22"/>
+          <w:lang w:val="en-GB"/>
+        </w:rPr>
+        <w:t xml:space="preserve"> III</w:t>
+      </w:r>
+      <w:r>
+        <w:rPr>
+          <w:rFonts w:ascii="Arial" w:hAnsi="Arial" w:cs="Arial"/>
+          <w:i/>
+          <w:sz w:val="21"/>
+          <w:szCs w:val="22"/>
+          <w:lang w:val="en-GB"/>
+        </w:rPr>
+        <w:t xml:space="preserve">                                                                                                                     </w:t>
+      </w:r>
+      <w:r>
+        <w:rPr>
+          <w:rFonts w:ascii="Arial" w:hAnsi="Arial" w:cs="Arial"/>
+          <w:i/>
+          <w:sz w:val="21"/>
+          <w:szCs w:val="22"/>
+          <w:lang w:val="en-GB"/>
+        </w:rPr>
+        <w:t>Jan 2025 – Apr 2025</w:t>
+      </w:r>
+      <w:r>
+        <w:rPr>
+          <w:rFonts w:ascii="Arial" w:hAnsi="Arial" w:cs="Arial"/>
+          <w:i/>
+          <w:sz w:val="21"/>
+          <w:szCs w:val="22"/>
+          <w:lang w:val="en-GB"/>
+        </w:rPr>
         <w:tab/>
       </w:r>
     </w:p>
@@ -1157,24 +1303,69 @@
         <w:rPr>
           <w:rFonts w:ascii="Arial" w:hAnsi="Arial" w:cs="Arial"/>
           <w:i/>
-          <w:iCs/>
-          <w:sz w:val="21"/>
-          <w:szCs w:val="21"/>
-          <w:lang w:val="en-GB"/>
-        </w:rPr>
-      </w:pPr>
-      <w:r>
-        <w:rPr>
-          <w:rFonts w:ascii="Arial" w:hAnsi="Arial" w:cs="Arial"/>
-          <w:i/>
-          <w:iCs/>
-          <w:sz w:val="21"/>
-          <w:szCs w:val="21"/>
-          <w:lang w:val="en-GB"/>
-        </w:rPr>
-        <w:t>Data Scientist - II</w:t>
-      </w:r>
-      <w:r>
+          <w:sz w:val="21"/>
+          <w:szCs w:val="22"/>
+          <w:lang w:val="en-GB"/>
+        </w:rPr>
+      </w:pPr>
+      <w:r>
+        <w:rPr>
+          <w:rFonts w:ascii="Arial" w:hAnsi="Arial" w:cs="Arial"/>
+          <w:i/>
+          <w:sz w:val="21"/>
+          <w:szCs w:val="22"/>
+          <w:lang w:val="en-GB"/>
+        </w:rPr>
+        <w:t xml:space="preserve">Data Scientist </w:t>
+      </w:r>
+      <w:r>
+        <w:rPr>
+          <w:rFonts w:ascii="Arial" w:hAnsi="Arial" w:cs="Arial"/>
+          <w:i/>
+          <w:sz w:val="21"/>
+          <w:szCs w:val="22"/>
+          <w:lang w:val="en-GB"/>
+        </w:rPr>
+        <w:t>–</w:t>
+      </w:r>
+      <w:r>
+        <w:rPr>
+          <w:rFonts w:ascii="Arial" w:hAnsi="Arial" w:cs="Arial"/>
+          <w:i/>
+          <w:sz w:val="21"/>
+          <w:szCs w:val="22"/>
+          <w:lang w:val="en-GB"/>
+        </w:rPr>
+        <w:t xml:space="preserve"> II</w:t>
+      </w:r>
+      <w:r>
+        <w:rPr>
+          <w:rFonts w:ascii="Arial" w:hAnsi="Arial" w:cs="Arial"/>
+          <w:i/>
+          <w:sz w:val="21"/>
+          <w:szCs w:val="22"/>
+          <w:lang w:val="en-GB"/>
+        </w:rPr>
+        <w:t xml:space="preserve">                                                                                                                      </w:t>
+      </w:r>
+      <w:r>
+        <w:rPr>
+          <w:rFonts w:ascii="Arial" w:hAnsi="Arial" w:cs="Arial"/>
+          <w:i/>
+          <w:sz w:val="21"/>
+          <w:szCs w:val="22"/>
+          <w:lang w:val="en-GB"/>
+        </w:rPr>
+        <w:t>Jul 2024 – Dec 2024</w:t>
+      </w:r>
+      <w:r>
+        <w:rPr>
+          <w:rFonts w:ascii="Arial" w:hAnsi="Arial" w:cs="Arial"/>
+          <w:i/>
+          <w:sz w:val="21"/>
+          <w:szCs w:val="22"/>
+          <w:lang w:val="en-GB"/>
+        </w:rPr>
         <w:tab/>
       </w:r>
     </w:p>
@@ -1294,6 +1485,17 @@
         </w:rPr>
         <w:t>ENTERPRISE MODEL MONITORING FRAMEWORK</w:t>
       </w:r>
+      <w:r>
+        <w:rPr>
+          <w:rFonts w:ascii="Arial" w:hAnsi="Arial" w:cs="Arial"/>
+          <w:b/>
+          <w:color w:val="404040"/>
+          <w:sz w:val="21"/>
+          <w:szCs w:val="22"/>
+          <w:lang w:val="en-GB"/>
+        </w:rPr>
+        <w:t xml:space="preserve">                           </w:t>
+      </w:r>
     </w:p>
     <w:p>
       <w:pPr>
@@ -1319,21 +1521,53 @@
           <w:szCs w:val="21"/>
           <w:lang w:val="en-GB"/>
         </w:rPr>
-        <w:t>Data Scientist - II</w:t>
+        <w:t xml:space="preserve">Data Scientist </w:t>
+      </w:r>
+      <w:r>
+        <w:rPr>
+          <w:rFonts w:ascii="Arial" w:hAnsi="Arial" w:cs="Arial"/>
+          <w:i/>
+          <w:iCs/>
+          <w:sz w:val="21"/>
+          <w:szCs w:val="21"/>
+          <w:lang w:val="en-GB"/>
+        </w:rPr>
+        <w:t>–</w:t>
+      </w:r>
+      <w:r>
+        <w:rPr>
+          <w:rFonts w:ascii="Arial" w:hAnsi="Arial" w:cs="Arial"/>
+          <w:i/>
+          <w:iCs/>
+          <w:sz w:val="21"/>
+          <w:szCs w:val="21"/>
+          <w:lang w:val="en-GB"/>
+        </w:rPr>
+        <w:t xml:space="preserve"> II</w:t>
+      </w:r>
+      <w:r>
+        <w:rPr>
+          <w:rFonts w:ascii="Arial" w:hAnsi="Arial" w:cs="Arial"/>
+          <w:i/>
+          <w:iCs/>
+          <w:sz w:val="21"/>
+          <w:szCs w:val="21"/>
+          <w:lang w:val="en-GB"/>
+        </w:rPr>
+        <w:t xml:space="preserve">                                                                                                                      </w:t>
+      </w:r>
+      <w:r>
+        <w:rPr>
+          <w:rFonts w:ascii="Arial" w:hAnsi="Arial" w:cs="Arial"/>
+          <w:i/>
+          <w:iCs/>
+          <w:sz w:val="21"/>
+          <w:szCs w:val="21"/>
+        </w:rPr>
+        <w:t>Jul 2023 – Jun 2024</w:t>
       </w:r>
       <w:r>
         <w:tab/>
-      </w:r>
-      <w:r>
-        <w:rPr>
-          <w:rFonts w:ascii="Arial" w:hAnsi="Arial" w:cs="Arial"/>
-          <w:i/>
-          <w:iCs/>
-          <w:sz w:val="21"/>
-          <w:szCs w:val="21"/>
-          <w:lang w:val="en-GB"/>
-        </w:rPr>
-        <w:t>J</w:t>
       </w:r>
     </w:p>
     <w:p>
@@ -1452,6 +1686,7 @@
           <w:szCs w:val="22"/>
           <w:lang w:val="en-GB"/>
         </w:rPr>
+        <w:lastRenderedPageBreak/>
         <w:t xml:space="preserve">UNIFIED </w:t>
       </w:r>
       <w:r>
@@ -1475,6 +1710,17 @@
           <w:lang w:val="en-GB"/>
         </w:rPr>
         <w:t xml:space="preserve"> FRAMEWORK</w:t>
+      </w:r>
+      <w:r>
+        <w:rPr>
+          <w:rFonts w:ascii="Arial" w:hAnsi="Arial" w:cs="Arial"/>
+          <w:b/>
+          <w:color w:val="404040"/>
+          <w:sz w:val="21"/>
+          <w:szCs w:val="22"/>
+          <w:lang w:val="en-GB"/>
+        </w:rPr>
+        <w:t xml:space="preserve">      </w:t>
       </w:r>
     </w:p>
     <w:p>
@@ -1486,25 +1732,70 @@
         <w:rPr>
           <w:rFonts w:ascii="Arial" w:hAnsi="Arial" w:cs="Arial"/>
           <w:i/>
-          <w:iCs/>
-          <w:sz w:val="21"/>
-          <w:szCs w:val="21"/>
-          <w:lang w:val="en-GB"/>
-        </w:rPr>
-      </w:pPr>
-      <w:r>
-        <w:rPr>
-          <w:rFonts w:ascii="Arial" w:hAnsi="Arial" w:cs="Arial"/>
-          <w:i/>
-          <w:iCs/>
-          <w:sz w:val="21"/>
-          <w:szCs w:val="21"/>
-          <w:lang w:val="en-GB"/>
-        </w:rPr>
-        <w:t>Data Scientist - I</w:t>
-      </w:r>
-      <w:r>
-        <w:tab/>
+          <w:sz w:val="21"/>
+          <w:szCs w:val="22"/>
+          <w:lang w:val="en-GB"/>
+        </w:rPr>
+      </w:pPr>
+      <w:r>
+        <w:rPr>
+          <w:rFonts w:ascii="Arial" w:hAnsi="Arial" w:cs="Arial"/>
+          <w:i/>
+          <w:sz w:val="21"/>
+          <w:szCs w:val="22"/>
+          <w:lang w:val="en-GB"/>
+        </w:rPr>
+        <w:t xml:space="preserve">Data Scientist </w:t>
+      </w:r>
+      <w:r>
+        <w:rPr>
+          <w:rFonts w:ascii="Arial" w:hAnsi="Arial" w:cs="Arial"/>
+          <w:i/>
+          <w:sz w:val="21"/>
+          <w:szCs w:val="22"/>
+          <w:lang w:val="en-GB"/>
+        </w:rPr>
+        <w:t>–</w:t>
+      </w:r>
+      <w:r>
+        <w:rPr>
+          <w:rFonts w:ascii="Arial" w:hAnsi="Arial" w:cs="Arial"/>
+          <w:i/>
+          <w:sz w:val="21"/>
+          <w:szCs w:val="22"/>
+          <w:lang w:val="en-GB"/>
+        </w:rPr>
+        <w:t xml:space="preserve"> I</w:t>
+      </w:r>
+      <w:r>
+        <w:rPr>
+          <w:rFonts w:ascii="Arial" w:hAnsi="Arial" w:cs="Arial"/>
+          <w:i/>
+          <w:sz w:val="21"/>
+          <w:szCs w:val="22"/>
+          <w:lang w:val="en-GB"/>
+        </w:rPr>
+        <w:t xml:space="preserve">                                                                                                                      </w:t>
+      </w:r>
+      <w:r>
+        <w:rPr>
+          <w:rFonts w:ascii="Arial" w:hAnsi="Arial" w:cs="Arial"/>
+          <w:i/>
+          <w:sz w:val="21"/>
+          <w:szCs w:val="22"/>
+          <w:lang w:val="en-GB"/>
+        </w:rPr>
+        <w:t>Jun 2022 – Jun 202</w:t>
+      </w:r>
+      <w:r>
+        <w:rPr>
+          <w:rFonts w:ascii="Arial" w:hAnsi="Arial" w:cs="Arial"/>
+          <w:i/>
+          <w:sz w:val="21"/>
+          <w:szCs w:val="22"/>
+          <w:lang w:val="en-GB"/>
+        </w:rPr>
+        <w:t>3</w:t>
       </w:r>
     </w:p>
     <w:p>
@@ -1793,7 +2084,16 @@
           <w:sz w:val="21"/>
           <w:szCs w:val="22"/>
         </w:rPr>
-        <w:t xml:space="preserve"> and summarization solution for government workflow digitization using Ol</w:t>
+        <w:t xml:space="preserve"> and summarization solution for government workflow digitization using </w:t>
+      </w:r>
+      <w:proofErr w:type="spellStart"/>
+      <w:r>
+        <w:rPr>
+          <w:rFonts w:ascii="Arial" w:hAnsi="Arial" w:cs="Arial"/>
+          <w:sz w:val="21"/>
+          <w:szCs w:val="22"/>
+        </w:rPr>
+        <w:t>Ol</w:t>
       </w:r>
       <w:r>
         <w:rPr>
@@ -1809,7 +2109,16 @@
           <w:sz w:val="21"/>
           <w:szCs w:val="22"/>
         </w:rPr>
-        <w:t>ma and Qwen, automating handwritten text extraction, summarization, and report generation in customizable templates and fonts.</w:t>
+        <w:t>ma</w:t>
+      </w:r>
+      <w:proofErr w:type="spellEnd"/>
+      <w:r>
+        <w:rPr>
+          <w:rFonts w:ascii="Arial" w:hAnsi="Arial" w:cs="Arial"/>
+          <w:sz w:val="21"/>
+          <w:szCs w:val="22"/>
+        </w:rPr>
+        <w:t xml:space="preserve"> and Qwen, automating handwritten text extraction, summarization, and report generation in customizable templates and fonts.</w:t>
       </w:r>
     </w:p>
     <w:p>
@@ -2404,23 +2713,39 @@
           <w:sz w:val="21"/>
           <w:szCs w:val="22"/>
         </w:rPr>
-        <w:t xml:space="preserve"> Data Visualization,</w:t>
-      </w:r>
-      <w:r>
-        <w:rPr>
-          <w:rFonts w:ascii="Arial" w:hAnsi="Arial" w:cs="Arial"/>
-          <w:sz w:val="21"/>
-          <w:szCs w:val="22"/>
-        </w:rPr>
-        <w:t xml:space="preserve"> Power BI,</w:t>
-      </w:r>
-      <w:r>
-        <w:rPr>
-          <w:rFonts w:ascii="Arial" w:hAnsi="Arial" w:cs="Arial"/>
-          <w:sz w:val="21"/>
-          <w:szCs w:val="22"/>
-        </w:rPr>
-        <w:t xml:space="preserve"> SQL</w:t>
+        <w:t xml:space="preserve"> </w:t>
+      </w:r>
+      <w:r>
+        <w:rPr>
+          <w:rFonts w:ascii="Arial" w:hAnsi="Arial" w:cs="Arial"/>
+          <w:sz w:val="21"/>
+          <w:szCs w:val="22"/>
+        </w:rPr>
+        <w:t>SQL</w:t>
+      </w:r>
+      <w:r>
+        <w:rPr>
+          <w:rFonts w:ascii="Arial" w:hAnsi="Arial" w:cs="Arial"/>
+          <w:sz w:val="21"/>
+          <w:szCs w:val="22"/>
+        </w:rPr>
+        <w:t xml:space="preserve">, </w:t>
+      </w:r>
+      <w:r>
+        <w:rPr>
+          <w:rFonts w:ascii="Arial" w:hAnsi="Arial" w:cs="Arial"/>
+          <w:sz w:val="21"/>
+          <w:szCs w:val="22"/>
+        </w:rPr>
+        <w:t>Data Visualization,</w:t>
+      </w:r>
+      <w:r>
+        <w:rPr>
+          <w:rFonts w:ascii="Arial" w:hAnsi="Arial" w:cs="Arial"/>
+          <w:sz w:val="21"/>
+          <w:szCs w:val="22"/>
+        </w:rPr>
+        <w:t xml:space="preserve"> Power BI</w:t>
       </w:r>
       <w:r>
         <w:rPr>
@@ -2448,6 +2773,61 @@
           <w:sz w:val="21"/>
           <w:szCs w:val="22"/>
         </w:rPr>
+        <w:t>GitLab</w:t>
+      </w:r>
+      <w:r>
+        <w:rPr>
+          <w:rFonts w:ascii="Arial" w:hAnsi="Arial" w:cs="Arial"/>
+          <w:sz w:val="21"/>
+          <w:szCs w:val="22"/>
+        </w:rPr>
+        <w:t xml:space="preserve">, </w:t>
+      </w:r>
+      <w:r>
+        <w:rPr>
+          <w:rFonts w:ascii="Arial" w:hAnsi="Arial" w:cs="Arial"/>
+          <w:sz w:val="21"/>
+          <w:szCs w:val="22"/>
+        </w:rPr>
+        <w:t>Apache Airflow,</w:t>
+      </w:r>
+      <w:r>
+        <w:rPr>
+          <w:rFonts w:ascii="Arial" w:hAnsi="Arial" w:cs="Arial"/>
+          <w:sz w:val="21"/>
+          <w:szCs w:val="22"/>
+        </w:rPr>
+        <w:t xml:space="preserve"> </w:t>
+      </w:r>
+      <w:r>
+        <w:rPr>
+          <w:rFonts w:ascii="Arial" w:hAnsi="Arial" w:cs="Arial"/>
+          <w:sz w:val="21"/>
+          <w:szCs w:val="22"/>
+        </w:rPr>
+        <w:t>Figma, MS Office</w:t>
+      </w:r>
+    </w:p>
+    <w:p>
+      <w:pPr>
+        <w:tabs>
+          <w:tab w:val="left" w:pos="630"/>
+          <w:tab w:val="left" w:pos="900"/>
+        </w:tabs>
+        <w:rPr>
+          <w:rFonts w:ascii="Arial" w:hAnsi="Arial" w:cs="Arial"/>
+          <w:sz w:val="21"/>
+          <w:szCs w:val="22"/>
+        </w:rPr>
+      </w:pPr>
+      <w:r>
+        <w:rPr>
+          <w:rFonts w:ascii="Arial" w:hAnsi="Arial" w:cs="Arial"/>
+          <w:b/>
+          <w:sz w:val="21"/>
+          <w:szCs w:val="22"/>
+          <w:lang w:val="en-GB"/>
+        </w:rPr>
         <w:t>Data Science</w:t>
       </w:r>
       <w:r>
@@ -2484,63 +2864,7 @@
           <w:sz w:val="21"/>
           <w:szCs w:val="22"/>
         </w:rPr>
-        <w:t>,</w:t>
-      </w:r>
-      <w:r>
-        <w:rPr>
-          <w:rFonts w:ascii="Arial" w:hAnsi="Arial" w:cs="Arial"/>
-          <w:sz w:val="21"/>
-          <w:szCs w:val="22"/>
-        </w:rPr>
-        <w:t xml:space="preserve"> </w:t>
-      </w:r>
-      <w:r>
-        <w:rPr>
-          <w:rFonts w:ascii="Arial" w:hAnsi="Arial" w:cs="Arial"/>
-          <w:sz w:val="21"/>
-          <w:szCs w:val="22"/>
-        </w:rPr>
-        <w:t>Random Forest</w:t>
-      </w:r>
-      <w:r>
-        <w:rPr>
-          <w:rFonts w:ascii="Arial" w:hAnsi="Arial" w:cs="Arial"/>
-          <w:sz w:val="21"/>
-          <w:szCs w:val="22"/>
-        </w:rPr>
-        <w:t>,</w:t>
-      </w:r>
-      <w:r>
-        <w:rPr>
-          <w:rFonts w:ascii="Arial" w:hAnsi="Arial" w:cs="Arial"/>
-          <w:sz w:val="21"/>
-          <w:szCs w:val="22"/>
-        </w:rPr>
-        <w:t xml:space="preserve"> Clustering,</w:t>
-      </w:r>
-      <w:r>
-        <w:rPr>
-          <w:rFonts w:ascii="Arial" w:hAnsi="Arial" w:cs="Arial"/>
-          <w:sz w:val="21"/>
-          <w:szCs w:val="22"/>
-        </w:rPr>
-        <w:t xml:space="preserve"> Linear Regression,</w:t>
-      </w:r>
-      <w:r>
-        <w:rPr>
-          <w:rFonts w:ascii="Arial" w:hAnsi="Arial" w:cs="Arial"/>
-          <w:sz w:val="21"/>
-          <w:szCs w:val="22"/>
-        </w:rPr>
-        <w:t xml:space="preserve"> </w:t>
-      </w:r>
-      <w:r>
-        <w:rPr>
-          <w:rFonts w:ascii="Arial" w:hAnsi="Arial" w:cs="Arial"/>
-          <w:sz w:val="21"/>
-          <w:szCs w:val="22"/>
-        </w:rPr>
-        <w:t>Constraint</w:t>
+        <w:t>, Random Forest, Clustering, Linear Regression, Constraint</w:t>
       </w:r>
       <w:r>
         <w:rPr>
@@ -2550,61 +2874,98 @@
         </w:rPr>
         <w:t xml:space="preserve"> Programming</w:t>
       </w:r>
-      <w:r>
-        <w:rPr>
-          <w:rFonts w:ascii="Arial" w:hAnsi="Arial" w:cs="Arial"/>
-          <w:sz w:val="21"/>
-          <w:szCs w:val="22"/>
-        </w:rPr>
-        <w:t xml:space="preserve">, </w:t>
-      </w:r>
-      <w:r>
-        <w:rPr>
-          <w:rFonts w:ascii="Arial" w:hAnsi="Arial" w:cs="Arial"/>
-          <w:sz w:val="21"/>
-          <w:szCs w:val="22"/>
-        </w:rPr>
-        <w:t>GitLab</w:t>
-      </w:r>
-      <w:r>
-        <w:rPr>
-          <w:rFonts w:ascii="Arial" w:hAnsi="Arial" w:cs="Arial"/>
-          <w:sz w:val="21"/>
-          <w:szCs w:val="22"/>
-        </w:rPr>
-        <w:t xml:space="preserve">, </w:t>
-      </w:r>
-      <w:r>
-        <w:rPr>
-          <w:rFonts w:ascii="Arial" w:hAnsi="Arial" w:cs="Arial"/>
-          <w:sz w:val="21"/>
-          <w:szCs w:val="22"/>
-        </w:rPr>
-        <w:t xml:space="preserve">Apache Airflow, </w:t>
-      </w:r>
-      <w:r>
-        <w:rPr>
-          <w:rFonts w:ascii="Arial" w:hAnsi="Arial" w:cs="Arial"/>
-          <w:sz w:val="21"/>
-          <w:szCs w:val="22"/>
-        </w:rPr>
-        <w:t xml:space="preserve">Amazon Web Services, </w:t>
-      </w:r>
-      <w:r>
-        <w:rPr>
-          <w:rFonts w:ascii="Arial" w:hAnsi="Arial" w:cs="Arial"/>
-          <w:sz w:val="21"/>
-          <w:szCs w:val="22"/>
-        </w:rPr>
-        <w:t>Alteryx, Alteryx Server,</w:t>
-      </w:r>
-      <w:r>
-        <w:rPr>
-          <w:rFonts w:ascii="Arial" w:hAnsi="Arial" w:cs="Arial"/>
-          <w:sz w:val="21"/>
-          <w:szCs w:val="22"/>
-        </w:rPr>
-        <w:t xml:space="preserve"> Figma, MS Office</w:t>
+    </w:p>
+    <w:p>
+      <w:pPr>
+        <w:tabs>
+          <w:tab w:val="left" w:pos="630"/>
+          <w:tab w:val="left" w:pos="900"/>
+        </w:tabs>
+        <w:rPr>
+          <w:rFonts w:ascii="Arial" w:hAnsi="Arial" w:cs="Arial"/>
+          <w:sz w:val="21"/>
+          <w:szCs w:val="22"/>
+        </w:rPr>
+      </w:pPr>
+      <w:proofErr w:type="spellStart"/>
+      <w:r>
+        <w:rPr>
+          <w:rFonts w:ascii="Arial" w:hAnsi="Arial" w:cs="Arial"/>
+          <w:b/>
+          <w:sz w:val="21"/>
+          <w:szCs w:val="22"/>
+          <w:lang w:val="en-GB"/>
+        </w:rPr>
+        <w:t>MLOps</w:t>
+      </w:r>
+      <w:proofErr w:type="spellEnd"/>
+      <w:r>
+        <w:rPr>
+          <w:rFonts w:ascii="Arial" w:hAnsi="Arial" w:cs="Arial"/>
+          <w:b/>
+          <w:sz w:val="21"/>
+          <w:szCs w:val="22"/>
+          <w:lang w:val="en-GB"/>
+        </w:rPr>
+        <w:t xml:space="preserve"> and Cloud: </w:t>
+      </w:r>
+      <w:r>
+        <w:rPr>
+          <w:rFonts w:ascii="Arial" w:hAnsi="Arial" w:cs="Arial"/>
+          <w:sz w:val="21"/>
+          <w:szCs w:val="22"/>
+        </w:rPr>
+        <w:t>Amazon Web Services (SageMaker</w:t>
+      </w:r>
+      <w:r>
+        <w:rPr>
+          <w:rFonts w:ascii="Arial" w:hAnsi="Arial" w:cs="Arial"/>
+          <w:sz w:val="21"/>
+          <w:szCs w:val="22"/>
+        </w:rPr>
+        <w:t xml:space="preserve"> Notebooks</w:t>
+      </w:r>
+      <w:r>
+        <w:rPr>
+          <w:rFonts w:ascii="Arial" w:hAnsi="Arial" w:cs="Arial"/>
+          <w:sz w:val="21"/>
+          <w:szCs w:val="22"/>
+        </w:rPr>
+        <w:t xml:space="preserve">, Lambda, Redshift, Aurora, S3, </w:t>
+      </w:r>
+      <w:proofErr w:type="spellStart"/>
+      <w:r>
+        <w:rPr>
+          <w:rFonts w:ascii="Arial" w:hAnsi="Arial" w:cs="Arial"/>
+          <w:sz w:val="21"/>
+          <w:szCs w:val="22"/>
+        </w:rPr>
+        <w:t>EventBridge</w:t>
+      </w:r>
+      <w:proofErr w:type="spellEnd"/>
+      <w:r>
+        <w:rPr>
+          <w:rFonts w:ascii="Arial" w:hAnsi="Arial" w:cs="Arial"/>
+          <w:sz w:val="21"/>
+          <w:szCs w:val="22"/>
+        </w:rPr>
+        <w:t>, Step Functions</w:t>
+      </w:r>
+      <w:r>
+        <w:rPr>
+          <w:rFonts w:ascii="Arial" w:hAnsi="Arial" w:cs="Arial"/>
+          <w:sz w:val="21"/>
+          <w:szCs w:val="22"/>
+        </w:rPr>
+        <w:t xml:space="preserve">), </w:t>
+      </w:r>
+      <w:r>
+        <w:rPr>
+          <w:rFonts w:ascii="Arial" w:hAnsi="Arial" w:cs="Arial"/>
+          <w:sz w:val="21"/>
+          <w:szCs w:val="22"/>
+        </w:rPr>
+        <w:t>Alteryx, Alteryx Server</w:t>
       </w:r>
     </w:p>
     <w:p>
@@ -3662,7 +4023,6 @@
   <w:style w:type="character" w:default="1" w:styleId="DefaultParagraphFont">
     <w:name w:val="Default Paragraph Font"/>
     <w:uiPriority w:val="1"/>
-    <w:semiHidden/>
     <w:unhideWhenUsed/>
   </w:style>
   <w:style w:type="table" w:default="1" w:styleId="TableNormal">

</xml_diff>

<commit_message>
uploaded the final version
</commit_message>
<xml_diff>
--- a/Devprasath_resume.docx
+++ b/Devprasath_resume.docx
@@ -229,7 +229,25 @@
           <w:szCs w:val="22"/>
           <w:lang w:val="en-GB"/>
         </w:rPr>
-        <w:t xml:space="preserve"> and production monitoring across enterprise environments. Skilled in Python, Apache Airflow, cloud-native architectures, and workflow automation, with a proven track record of leading cross-functional teams and delivering measurable operational efficiency and cost optimization initiatives.</w:t>
+        <w:t xml:space="preserve"> and production monitoring across enterprise environments. Skilled in Python, Apache Airflow, cloud-native architectures, and workflow automation. Demonstrated expertise in constraint programming-based scheduling optimization and ML</w:t>
+      </w:r>
+      <w:r>
+        <w:rPr>
+          <w:rFonts w:ascii="Arial" w:hAnsi="Arial" w:cs="Arial"/>
+          <w:sz w:val="21"/>
+          <w:szCs w:val="22"/>
+          <w:lang w:val="en-GB"/>
+        </w:rPr>
+        <w:t xml:space="preserve"> </w:t>
+      </w:r>
+      <w:r>
+        <w:rPr>
+          <w:rFonts w:ascii="Arial" w:hAnsi="Arial" w:cs="Arial"/>
+          <w:sz w:val="21"/>
+          <w:szCs w:val="22"/>
+          <w:lang w:val="en-GB"/>
+        </w:rPr>
+        <w:t>driven churn prediction, delivering 80% precision models and 20% infrastructure cost reduction in production environments.</w:t>
       </w:r>
     </w:p>
     <w:p>
@@ -892,17 +910,7 @@
           <w:szCs w:val="22"/>
           <w:lang w:val="en-GB"/>
         </w:rPr>
-        <w:t xml:space="preserve">                                                                                                                   </w:t>
-      </w:r>
-      <w:r>
-        <w:rPr>
-          <w:rFonts w:ascii="Arial" w:hAnsi="Arial" w:cs="Arial"/>
-          <w:i/>
-          <w:sz w:val="21"/>
-          <w:szCs w:val="22"/>
-          <w:lang w:val="en-GB"/>
-        </w:rPr>
-        <w:t>May 2025 – Dec 2025</w:t>
+        <w:t xml:space="preserve">                                                                                                                   May 2025 – Dec 2025</w:t>
       </w:r>
       <w:r>
         <w:rPr>
@@ -1117,17 +1125,7 @@
           <w:szCs w:val="22"/>
           <w:lang w:val="en-GB"/>
         </w:rPr>
-        <w:t xml:space="preserve">                                                                                                                     </w:t>
-      </w:r>
-      <w:r>
-        <w:rPr>
-          <w:rFonts w:ascii="Arial" w:hAnsi="Arial" w:cs="Arial"/>
-          <w:i/>
-          <w:sz w:val="21"/>
-          <w:szCs w:val="22"/>
-          <w:lang w:val="en-GB"/>
-        </w:rPr>
-        <w:t>Jan 2025 – Apr 2025</w:t>
+        <w:t xml:space="preserve">                                                                                                                     Jan 2025 – Apr 2025</w:t>
       </w:r>
       <w:r>
         <w:rPr>
@@ -1346,17 +1344,7 @@
           <w:szCs w:val="22"/>
           <w:lang w:val="en-GB"/>
         </w:rPr>
-        <w:t xml:space="preserve">                                                                                                                      </w:t>
-      </w:r>
-      <w:r>
-        <w:rPr>
-          <w:rFonts w:ascii="Arial" w:hAnsi="Arial" w:cs="Arial"/>
-          <w:i/>
-          <w:sz w:val="21"/>
-          <w:szCs w:val="22"/>
-          <w:lang w:val="en-GB"/>
-        </w:rPr>
-        <w:t>Jul 2024 – Dec 2024</w:t>
+        <w:t xml:space="preserve">                                                                                                                      Jul 2024 – Dec 2024</w:t>
       </w:r>
       <w:r>
         <w:rPr>
@@ -1686,7 +1674,6 @@
           <w:szCs w:val="22"/>
           <w:lang w:val="en-GB"/>
         </w:rPr>
-        <w:lastRenderedPageBreak/>
         <w:t xml:space="preserve">UNIFIED </w:t>
       </w:r>
       <w:r>
@@ -1775,17 +1762,7 @@
           <w:szCs w:val="22"/>
           <w:lang w:val="en-GB"/>
         </w:rPr>
-        <w:t xml:space="preserve">                                                                                                                      </w:t>
-      </w:r>
-      <w:r>
-        <w:rPr>
-          <w:rFonts w:ascii="Arial" w:hAnsi="Arial" w:cs="Arial"/>
-          <w:i/>
-          <w:sz w:val="21"/>
-          <w:szCs w:val="22"/>
-          <w:lang w:val="en-GB"/>
-        </w:rPr>
-        <w:t>Jun 2022 – Jun 202</w:t>
+        <w:t xml:space="preserve">                                                                                                                      Jun 2022 – Jun 202</w:t>
       </w:r>
       <w:r>
         <w:rPr>
@@ -2976,57 +2953,6 @@
         </w:tabs>
         <w:rPr>
           <w:rFonts w:ascii="Arial" w:hAnsi="Arial" w:cs="Arial"/>
-          <w:sz w:val="21"/>
-          <w:szCs w:val="22"/>
-        </w:rPr>
-      </w:pPr>
-      <w:r>
-        <w:rPr>
-          <w:rFonts w:ascii="Arial" w:hAnsi="Arial" w:cs="Arial"/>
-          <w:b/>
-          <w:bCs/>
-          <w:sz w:val="21"/>
-          <w:szCs w:val="22"/>
-        </w:rPr>
-        <w:t xml:space="preserve">Databases </w:t>
-      </w:r>
-      <w:r>
-        <w:rPr>
-          <w:rFonts w:ascii="Arial" w:hAnsi="Arial" w:cs="Arial"/>
-          <w:b/>
-          <w:bCs/>
-          <w:sz w:val="21"/>
-          <w:szCs w:val="22"/>
-        </w:rPr>
-        <w:t>and</w:t>
-      </w:r>
-      <w:r>
-        <w:rPr>
-          <w:rFonts w:ascii="Arial" w:hAnsi="Arial" w:cs="Arial"/>
-          <w:b/>
-          <w:bCs/>
-          <w:sz w:val="21"/>
-          <w:szCs w:val="22"/>
-        </w:rPr>
-        <w:t xml:space="preserve"> Platforms:</w:t>
-      </w:r>
-      <w:r>
-        <w:rPr>
-          <w:rFonts w:ascii="Arial" w:hAnsi="Arial" w:cs="Arial"/>
-          <w:sz w:val="21"/>
-          <w:szCs w:val="22"/>
-        </w:rPr>
-        <w:t xml:space="preserve"> Teradata, Amazon Redshift, Amazon Aurora, Amazon S3</w:t>
-      </w:r>
-    </w:p>
-    <w:p>
-      <w:pPr>
-        <w:tabs>
-          <w:tab w:val="left" w:pos="630"/>
-          <w:tab w:val="left" w:pos="900"/>
-        </w:tabs>
-        <w:rPr>
-          <w:rFonts w:ascii="Arial" w:hAnsi="Arial" w:cs="Arial"/>
           <w:sz w:val="13"/>
           <w:szCs w:val="13"/>
         </w:rPr>
@@ -3133,33 +3059,6 @@
           <w:lang w:val="en-GB"/>
         </w:rPr>
         <w:t xml:space="preserve"> in Alteryx Designer Core</w:t>
-      </w:r>
-      <w:r>
-        <w:rPr>
-          <w:rFonts w:ascii="Arial" w:hAnsi="Arial" w:cs="Arial"/>
-          <w:sz w:val="21"/>
-          <w:szCs w:val="22"/>
-          <w:lang w:val="en-GB"/>
-        </w:rPr>
-        <w:t>, Google ML crash course (in pro</w:t>
-      </w:r>
-      <w:r>
-        <w:rPr>
-          <w:rFonts w:ascii="Arial" w:hAnsi="Arial" w:cs="Arial"/>
-          <w:sz w:val="21"/>
-          <w:szCs w:val="22"/>
-          <w:lang w:val="en-GB"/>
-        </w:rPr>
-        <w:t>gress</w:t>
-      </w:r>
-      <w:r>
-        <w:rPr>
-          <w:rFonts w:ascii="Arial" w:hAnsi="Arial" w:cs="Arial"/>
-          <w:sz w:val="21"/>
-          <w:szCs w:val="22"/>
-          <w:lang w:val="en-GB"/>
-        </w:rPr>
-        <w:t>)</w:t>
       </w:r>
     </w:p>
     <w:p>

</xml_diff>

<commit_message>
Fixed the missing params
</commit_message>
<xml_diff>
--- a/Devprasath_resume.docx
+++ b/Devprasath_resume.docx
@@ -2908,7 +2908,7 @@
           <w:sz w:val="21"/>
           <w:szCs w:val="22"/>
         </w:rPr>
-        <w:t xml:space="preserve">, Lambda, Redshift, Aurora, S3, </w:t>
+        <w:t xml:space="preserve">, Lambda, </w:t>
       </w:r>
       <w:proofErr w:type="spellStart"/>
       <w:r>
@@ -2943,6 +2943,59 @@
           <w:szCs w:val="22"/>
         </w:rPr>
         <w:t>Alteryx, Alteryx Server</w:t>
+      </w:r>
+    </w:p>
+    <w:p>
+      <w:pPr>
+        <w:tabs>
+          <w:tab w:val="left" w:pos="630"/>
+          <w:tab w:val="left" w:pos="900"/>
+        </w:tabs>
+        <w:rPr>
+          <w:rFonts w:ascii="Arial" w:hAnsi="Arial" w:cs="Arial"/>
+          <w:sz w:val="21"/>
+          <w:szCs w:val="22"/>
+        </w:rPr>
+      </w:pPr>
+      <w:r>
+        <w:rPr>
+          <w:rFonts w:ascii="Arial" w:hAnsi="Arial" w:cs="Arial"/>
+          <w:b/>
+          <w:sz w:val="21"/>
+          <w:szCs w:val="22"/>
+          <w:lang w:val="en-GB"/>
+        </w:rPr>
+        <w:t>D</w:t>
+      </w:r>
+      <w:r>
+        <w:rPr>
+          <w:rFonts w:ascii="Arial" w:hAnsi="Arial" w:cs="Arial"/>
+          <w:b/>
+          <w:sz w:val="21"/>
+          <w:szCs w:val="22"/>
+          <w:lang w:val="en-GB"/>
+        </w:rPr>
+        <w:t xml:space="preserve">atabases and Platforms: </w:t>
+      </w:r>
+      <w:r>
+        <w:rPr>
+          <w:rFonts w:ascii="Arial" w:hAnsi="Arial" w:cs="Arial"/>
+          <w:bCs/>
+          <w:sz w:val="21"/>
+          <w:szCs w:val="22"/>
+          <w:lang w:val="en-GB"/>
+        </w:rPr>
+        <w:t>Teradata</w:t>
+      </w:r>
+      <w:r>
+        <w:rPr>
+          <w:rFonts w:ascii="Arial" w:hAnsi="Arial" w:cs="Arial"/>
+          <w:bCs/>
+          <w:sz w:val="21"/>
+          <w:szCs w:val="22"/>
+          <w:lang w:val="en-GB"/>
+        </w:rPr>
+        <w:t>, Amazon Redshift, Aurora, Amazon S3</w:t>
       </w:r>
     </w:p>
     <w:p>
@@ -3059,6 +3112,15 @@
           <w:lang w:val="en-GB"/>
         </w:rPr>
         <w:t xml:space="preserve"> in Alteryx Designer Core</w:t>
+      </w:r>
+      <w:r>
+        <w:rPr>
+          <w:rFonts w:ascii="Arial" w:hAnsi="Arial" w:cs="Arial"/>
+          <w:sz w:val="21"/>
+          <w:szCs w:val="22"/>
+          <w:lang w:val="en-GB"/>
+        </w:rPr>
+        <w:t>, Google ML crash course (in progress)</w:t>
       </w:r>
     </w:p>
     <w:p>

</xml_diff>